<commit_message>
docs(eva-02): publica el informe actualizado y la presentacion oral.
</commit_message>
<xml_diff>
--- a/evaluaciones/eva-02/informe/2.2.2-Gestion-de-cambios-Kiran v2.docx
+++ b/evaluaciones/eva-02/informe/2.2.2-Gestion-de-cambios-Kiran v2.docx
@@ -251,7 +251,7 @@
                 <w:rFonts w:ascii="Times New Roman" w:eastAsia="Times New Roman" w:hAnsi="Times New Roman"/>
                 <w:sz w:val="18"/>
               </w:rPr>
-              <w:t>Puente Alto, vespertino</w:t>
+              <w:t>Puente Alto, jornada vespertina</w:t>
             </w:r>
           </w:p>
         </w:tc>
@@ -361,7 +361,7 @@
                 <w:rFonts w:ascii="Times New Roman" w:eastAsia="Times New Roman" w:hAnsi="Times New Roman"/>
                 <w:sz w:val="18"/>
               </w:rPr>
-              <w:t>Gestión de Proyectos de Software</w:t>
+              <w:t>GPY1102 Gestión de Proyectos de Software</w:t>
             </w:r>
           </w:p>
         </w:tc>
@@ -380,18 +380,19 @@
               <w:bottom w:val="single" w:sz="4" w:space="0" w:color="BFBFBF"/>
               <w:right w:val="single" w:sz="4" w:space="0" w:color="BFBFBF"/>
             </w:tcBorders>
-            <w:vAlign w:val="center"/>
-          </w:tcPr>
-          <w:p>
-            <w:pPr>
-              <w:spacing w:before="40" w:after="40" w:line="252" w:lineRule="auto"/>
-            </w:pPr>
-            <w:r>
-              <w:rPr>
-                <w:rFonts w:ascii="Times New Roman" w:eastAsia="Times New Roman" w:hAnsi="Times New Roman"/>
-                <w:sz w:val="18"/>
-              </w:rPr>
-              <w:t>Sigla</w:t>
+            <w:shd w:val="clear" w:color="auto" w:fill="F4F7FB"/>
+            <w:vAlign w:val="center"/>
+          </w:tcPr>
+          <w:p>
+            <w:pPr>
+              <w:spacing w:before="40" w:after="40" w:line="252" w:lineRule="auto"/>
+            </w:pPr>
+            <w:r>
+              <w:rPr>
+                <w:rFonts w:ascii="Times New Roman" w:eastAsia="Times New Roman" w:hAnsi="Times New Roman"/>
+                <w:sz w:val="18"/>
+              </w:rPr>
+              <w:t>Actividad</w:t>
             </w:r>
           </w:p>
         </w:tc>
@@ -404,18 +405,19 @@
               <w:bottom w:val="single" w:sz="4" w:space="0" w:color="BFBFBF"/>
               <w:right w:val="single" w:sz="4" w:space="0" w:color="BFBFBF"/>
             </w:tcBorders>
-            <w:vAlign w:val="center"/>
-          </w:tcPr>
-          <w:p>
-            <w:pPr>
-              <w:spacing w:before="40" w:after="40" w:line="252" w:lineRule="auto"/>
-            </w:pPr>
-            <w:r>
-              <w:rPr>
-                <w:rFonts w:ascii="Times New Roman" w:eastAsia="Times New Roman" w:hAnsi="Times New Roman"/>
-                <w:sz w:val="18"/>
-              </w:rPr>
-              <w:t>GPY1102</w:t>
+            <w:shd w:val="clear" w:color="auto" w:fill="F4F7FB"/>
+            <w:vAlign w:val="center"/>
+          </w:tcPr>
+          <w:p>
+            <w:pPr>
+              <w:spacing w:before="40" w:after="40" w:line="252" w:lineRule="auto"/>
+            </w:pPr>
+            <w:r>
+              <w:rPr>
+                <w:rFonts w:ascii="Times New Roman" w:eastAsia="Times New Roman" w:hAnsi="Times New Roman"/>
+                <w:sz w:val="18"/>
+              </w:rPr>
+              <w:t>2.2.2  Gestión de cambios en proyectos de software</w:t>
             </w:r>
           </w:p>
         </w:tc>
@@ -434,19 +436,18 @@
               <w:bottom w:val="single" w:sz="4" w:space="0" w:color="BFBFBF"/>
               <w:right w:val="single" w:sz="4" w:space="0" w:color="BFBFBF"/>
             </w:tcBorders>
-            <w:shd w:val="clear" w:color="auto" w:fill="F4F7FB"/>
-            <w:vAlign w:val="center"/>
-          </w:tcPr>
-          <w:p>
-            <w:pPr>
-              <w:spacing w:before="40" w:after="40" w:line="252" w:lineRule="auto"/>
-            </w:pPr>
-            <w:r>
-              <w:rPr>
-                <w:rFonts w:ascii="Times New Roman" w:eastAsia="Times New Roman" w:hAnsi="Times New Roman"/>
-                <w:sz w:val="18"/>
-              </w:rPr>
-              <w:t>Actividad</w:t>
+            <w:vAlign w:val="center"/>
+          </w:tcPr>
+          <w:p>
+            <w:pPr>
+              <w:spacing w:before="40" w:after="40" w:line="252" w:lineRule="auto"/>
+            </w:pPr>
+            <w:r>
+              <w:rPr>
+                <w:rFonts w:ascii="Times New Roman" w:eastAsia="Times New Roman" w:hAnsi="Times New Roman"/>
+                <w:sz w:val="18"/>
+              </w:rPr>
+              <w:t>Indicador de logro</w:t>
             </w:r>
           </w:p>
         </w:tc>
@@ -459,19 +460,18 @@
               <w:bottom w:val="single" w:sz="4" w:space="0" w:color="BFBFBF"/>
               <w:right w:val="single" w:sz="4" w:space="0" w:color="BFBFBF"/>
             </w:tcBorders>
-            <w:shd w:val="clear" w:color="auto" w:fill="F4F7FB"/>
-            <w:vAlign w:val="center"/>
-          </w:tcPr>
-          <w:p>
-            <w:pPr>
-              <w:spacing w:before="40" w:after="40" w:line="252" w:lineRule="auto"/>
-            </w:pPr>
-            <w:r>
-              <w:rPr>
-                <w:rFonts w:ascii="Times New Roman" w:eastAsia="Times New Roman" w:hAnsi="Times New Roman"/>
-                <w:sz w:val="18"/>
-              </w:rPr>
-              <w:t>2.2.2  Gestión de cambios en proyectos de software</w:t>
+            <w:vAlign w:val="center"/>
+          </w:tcPr>
+          <w:p>
+            <w:pPr>
+              <w:spacing w:before="40" w:after="40" w:line="252" w:lineRule="auto"/>
+            </w:pPr>
+            <w:r>
+              <w:rPr>
+                <w:rFonts w:ascii="Times New Roman" w:eastAsia="Times New Roman" w:hAnsi="Times New Roman"/>
+                <w:sz w:val="18"/>
+              </w:rPr>
+              <w:t>2.2  Gestiona cambios en el proyecto de manera ágil y eficiente, resolviendo situaciones complejas en casos de la industria, para asegurar la integridad del plan inicial.</w:t>
             </w:r>
           </w:p>
         </w:tc>
@@ -490,18 +490,19 @@
               <w:bottom w:val="single" w:sz="4" w:space="0" w:color="BFBFBF"/>
               <w:right w:val="single" w:sz="4" w:space="0" w:color="BFBFBF"/>
             </w:tcBorders>
-            <w:vAlign w:val="center"/>
-          </w:tcPr>
-          <w:p>
-            <w:pPr>
-              <w:spacing w:before="40" w:after="40" w:line="252" w:lineRule="auto"/>
-            </w:pPr>
-            <w:r>
-              <w:rPr>
-                <w:rFonts w:ascii="Times New Roman" w:eastAsia="Times New Roman" w:hAnsi="Times New Roman"/>
-                <w:sz w:val="18"/>
-              </w:rPr>
-              <w:t>Indicador de logro</w:t>
+            <w:shd w:val="clear" w:color="auto" w:fill="F4F7FB"/>
+            <w:vAlign w:val="center"/>
+          </w:tcPr>
+          <w:p>
+            <w:pPr>
+              <w:spacing w:before="40" w:after="40" w:line="252" w:lineRule="auto"/>
+            </w:pPr>
+            <w:r>
+              <w:rPr>
+                <w:rFonts w:ascii="Times New Roman" w:eastAsia="Times New Roman" w:hAnsi="Times New Roman"/>
+                <w:sz w:val="18"/>
+              </w:rPr>
+              <w:t>Docente</w:t>
             </w:r>
           </w:p>
         </w:tc>
@@ -514,18 +515,19 @@
               <w:bottom w:val="single" w:sz="4" w:space="0" w:color="BFBFBF"/>
               <w:right w:val="single" w:sz="4" w:space="0" w:color="BFBFBF"/>
             </w:tcBorders>
-            <w:vAlign w:val="center"/>
-          </w:tcPr>
-          <w:p>
-            <w:pPr>
-              <w:spacing w:before="40" w:after="40" w:line="252" w:lineRule="auto"/>
-            </w:pPr>
-            <w:r>
-              <w:rPr>
-                <w:rFonts w:ascii="Times New Roman" w:eastAsia="Times New Roman" w:hAnsi="Times New Roman"/>
-                <w:sz w:val="18"/>
-              </w:rPr>
-              <w:t>2.2  Gestionar cambios de manera ágil, resolviendo situaciones complejas del caso, para asegurar la integridad del plan inicial</w:t>
+            <w:shd w:val="clear" w:color="auto" w:fill="F4F7FB"/>
+            <w:vAlign w:val="center"/>
+          </w:tcPr>
+          <w:p>
+            <w:pPr>
+              <w:spacing w:before="40" w:after="40" w:line="252" w:lineRule="auto"/>
+            </w:pPr>
+            <w:r>
+              <w:rPr>
+                <w:rFonts w:ascii="Times New Roman" w:eastAsia="Times New Roman" w:hAnsi="Times New Roman"/>
+                <w:sz w:val="18"/>
+              </w:rPr>
+              <w:t>Juan Bautista Sáez Fernández</w:t>
             </w:r>
           </w:p>
         </w:tc>
@@ -556,7 +558,7 @@
                 <w:rFonts w:ascii="Times New Roman" w:eastAsia="Times New Roman" w:hAnsi="Times New Roman"/>
                 <w:sz w:val="18"/>
               </w:rPr>
-              <w:t>Docente</w:t>
+              <w:t>Sección</w:t>
             </w:r>
           </w:p>
         </w:tc>
@@ -581,7 +583,7 @@
                 <w:rFonts w:ascii="Times New Roman" w:eastAsia="Times New Roman" w:hAnsi="Times New Roman"/>
                 <w:sz w:val="18"/>
               </w:rPr>
-              <w:t>Juan Bautista Sáez Fernández</w:t>
+              <w:t>001-V</w:t>
             </w:r>
           </w:p>
         </w:tc>
@@ -611,7 +613,7 @@
                 <w:rFonts w:ascii="Times New Roman" w:eastAsia="Times New Roman" w:hAnsi="Times New Roman"/>
                 <w:sz w:val="18"/>
               </w:rPr>
-              <w:t>Estudiante</w:t>
+              <w:t>Equipo</w:t>
             </w:r>
           </w:p>
         </w:tc>
@@ -635,7 +637,7 @@
                 <w:rFonts w:ascii="Times New Roman" w:eastAsia="Times New Roman" w:hAnsi="Times New Roman"/>
                 <w:sz w:val="18"/>
               </w:rPr>
-              <w:t>Giannina Guerrero</w:t>
+              <w:t>Equipo Kiran: Giannina Guerrero (directora del proyecto y frontend), Nicolás Barra (backend e inventario), Ari Araya (infraestructura y nube) y Skarlett Tropan (calidad e impacto)</w:t>
             </w:r>
           </w:p>
         </w:tc>
@@ -654,19 +656,18 @@
               <w:bottom w:val="single" w:sz="4" w:space="0" w:color="BFBFBF"/>
               <w:right w:val="single" w:sz="4" w:space="0" w:color="BFBFBF"/>
             </w:tcBorders>
-            <w:shd w:val="clear" w:color="auto" w:fill="F4F7FB"/>
-            <w:vAlign w:val="center"/>
-          </w:tcPr>
-          <w:p>
-            <w:pPr>
-              <w:spacing w:before="40" w:after="40" w:line="252" w:lineRule="auto"/>
-            </w:pPr>
-            <w:r>
-              <w:rPr>
-                <w:rFonts w:ascii="Times New Roman" w:eastAsia="Times New Roman" w:hAnsi="Times New Roman"/>
-                <w:sz w:val="18"/>
-              </w:rPr>
-              <w:t>Correo</w:t>
+            <w:vAlign w:val="center"/>
+          </w:tcPr>
+          <w:p>
+            <w:pPr>
+              <w:spacing w:before="40" w:after="40" w:line="252" w:lineRule="auto"/>
+            </w:pPr>
+            <w:r>
+              <w:rPr>
+                <w:rFonts w:ascii="Times New Roman" w:eastAsia="Times New Roman" w:hAnsi="Times New Roman"/>
+                <w:sz w:val="18"/>
+              </w:rPr>
+              <w:t>Proyecto</w:t>
             </w:r>
           </w:p>
         </w:tc>
@@ -679,19 +680,18 @@
               <w:bottom w:val="single" w:sz="4" w:space="0" w:color="BFBFBF"/>
               <w:right w:val="single" w:sz="4" w:space="0" w:color="BFBFBF"/>
             </w:tcBorders>
-            <w:shd w:val="clear" w:color="auto" w:fill="F4F7FB"/>
-            <w:vAlign w:val="center"/>
-          </w:tcPr>
-          <w:p>
-            <w:pPr>
-              <w:spacing w:before="40" w:after="40" w:line="252" w:lineRule="auto"/>
-            </w:pPr>
-            <w:r>
-              <w:rPr>
-                <w:rFonts w:ascii="Times New Roman" w:eastAsia="Times New Roman" w:hAnsi="Times New Roman"/>
-                <w:sz w:val="18"/>
-              </w:rPr>
-              <w:t>gia.guerrero@duocuc.cl</w:t>
+            <w:vAlign w:val="center"/>
+          </w:tcPr>
+          <w:p>
+            <w:pPr>
+              <w:spacing w:before="40" w:after="40" w:line="252" w:lineRule="auto"/>
+            </w:pPr>
+            <w:r>
+              <w:rPr>
+                <w:rFonts w:ascii="Times New Roman" w:eastAsia="Times New Roman" w:hAnsi="Times New Roman"/>
+                <w:sz w:val="18"/>
+              </w:rPr>
+              <w:t>Kiran</w:t>
             </w:r>
           </w:p>
         </w:tc>
@@ -710,18 +710,19 @@
               <w:bottom w:val="single" w:sz="4" w:space="0" w:color="BFBFBF"/>
               <w:right w:val="single" w:sz="4" w:space="0" w:color="BFBFBF"/>
             </w:tcBorders>
-            <w:vAlign w:val="center"/>
-          </w:tcPr>
-          <w:p>
-            <w:pPr>
-              <w:spacing w:before="40" w:after="40" w:line="252" w:lineRule="auto"/>
-            </w:pPr>
-            <w:r>
-              <w:rPr>
-                <w:rFonts w:ascii="Times New Roman" w:eastAsia="Times New Roman" w:hAnsi="Times New Roman"/>
-                <w:sz w:val="18"/>
-              </w:rPr>
-              <w:t>Proyecto</w:t>
+            <w:shd w:val="clear" w:color="auto" w:fill="F4F7FB"/>
+            <w:vAlign w:val="center"/>
+          </w:tcPr>
+          <w:p>
+            <w:pPr>
+              <w:spacing w:before="40" w:after="40" w:line="252" w:lineRule="auto"/>
+            </w:pPr>
+            <w:r>
+              <w:rPr>
+                <w:rFonts w:ascii="Times New Roman" w:eastAsia="Times New Roman" w:hAnsi="Times New Roman"/>
+                <w:sz w:val="18"/>
+              </w:rPr>
+              <w:t>Ventana del proyecto</w:t>
             </w:r>
           </w:p>
         </w:tc>
@@ -734,18 +735,19 @@
               <w:bottom w:val="single" w:sz="4" w:space="0" w:color="BFBFBF"/>
               <w:right w:val="single" w:sz="4" w:space="0" w:color="BFBFBF"/>
             </w:tcBorders>
-            <w:vAlign w:val="center"/>
-          </w:tcPr>
-          <w:p>
-            <w:pPr>
-              <w:spacing w:before="40" w:after="40" w:line="252" w:lineRule="auto"/>
-            </w:pPr>
-            <w:r>
-              <w:rPr>
-                <w:rFonts w:ascii="Times New Roman" w:eastAsia="Times New Roman" w:hAnsi="Times New Roman"/>
-                <w:sz w:val="18"/>
-              </w:rPr>
-              <w:t>Kiran</w:t>
+            <w:shd w:val="clear" w:color="auto" w:fill="F4F7FB"/>
+            <w:vAlign w:val="center"/>
+          </w:tcPr>
+          <w:p>
+            <w:pPr>
+              <w:spacing w:before="40" w:after="40" w:line="252" w:lineRule="auto"/>
+            </w:pPr>
+            <w:r>
+              <w:rPr>
+                <w:rFonts w:ascii="Times New Roman" w:eastAsia="Times New Roman" w:hAnsi="Times New Roman"/>
+                <w:sz w:val="18"/>
+              </w:rPr>
+              <w:t>14 de septiembre de 2026 al 9 de diciembre de 2026</w:t>
             </w:r>
           </w:p>
         </w:tc>
@@ -764,19 +766,18 @@
               <w:bottom w:val="single" w:sz="4" w:space="0" w:color="BFBFBF"/>
               <w:right w:val="single" w:sz="4" w:space="0" w:color="BFBFBF"/>
             </w:tcBorders>
-            <w:shd w:val="clear" w:color="auto" w:fill="F4F7FB"/>
-            <w:vAlign w:val="center"/>
-          </w:tcPr>
-          <w:p>
-            <w:pPr>
-              <w:spacing w:before="40" w:after="40" w:line="252" w:lineRule="auto"/>
-            </w:pPr>
-            <w:r>
-              <w:rPr>
-                <w:rFonts w:ascii="Times New Roman" w:eastAsia="Times New Roman" w:hAnsi="Times New Roman"/>
-                <w:sz w:val="18"/>
-              </w:rPr>
-              <w:t>Ventana del proyecto</w:t>
+            <w:vAlign w:val="center"/>
+          </w:tcPr>
+          <w:p>
+            <w:pPr>
+              <w:spacing w:before="40" w:after="40" w:line="252" w:lineRule="auto"/>
+            </w:pPr>
+            <w:r>
+              <w:rPr>
+                <w:rFonts w:ascii="Times New Roman" w:eastAsia="Times New Roman" w:hAnsi="Times New Roman"/>
+                <w:sz w:val="18"/>
+              </w:rPr>
+              <w:t>Techo</w:t>
             </w:r>
           </w:p>
         </w:tc>
@@ -789,73 +790,18 @@
               <w:bottom w:val="single" w:sz="4" w:space="0" w:color="BFBFBF"/>
               <w:right w:val="single" w:sz="4" w:space="0" w:color="BFBFBF"/>
             </w:tcBorders>
-            <w:shd w:val="clear" w:color="auto" w:fill="F4F7FB"/>
-            <w:vAlign w:val="center"/>
-          </w:tcPr>
-          <w:p>
-            <w:pPr>
-              <w:spacing w:before="40" w:after="40" w:line="252" w:lineRule="auto"/>
-            </w:pPr>
-            <w:r>
-              <w:rPr>
-                <w:rFonts w:ascii="Times New Roman" w:eastAsia="Times New Roman" w:hAnsi="Times New Roman"/>
-                <w:sz w:val="18"/>
-              </w:rPr>
-              <w:t>14 de septiembre de 2026 al 9 de diciembre de 2026</w:t>
-            </w:r>
-          </w:p>
-        </w:tc>
-      </w:tr>
-      <w:tr>
-        <w:trPr>
-          <w:cantSplit/>
-          <w:jc w:val="center"/>
-        </w:trPr>
-        <w:tc>
-          <w:tcPr>
-            <w:tcW w:w="2381" w:type="dxa"/>
-            <w:tcBorders>
-              <w:top w:val="single" w:sz="4" w:space="0" w:color="BFBFBF"/>
-              <w:left w:val="single" w:sz="4" w:space="0" w:color="BFBFBF"/>
-              <w:bottom w:val="single" w:sz="4" w:space="0" w:color="BFBFBF"/>
-              <w:right w:val="single" w:sz="4" w:space="0" w:color="BFBFBF"/>
-            </w:tcBorders>
-            <w:vAlign w:val="center"/>
-          </w:tcPr>
-          <w:p>
-            <w:pPr>
-              <w:spacing w:before="40" w:after="40" w:line="252" w:lineRule="auto"/>
-            </w:pPr>
-            <w:r>
-              <w:rPr>
-                <w:rFonts w:ascii="Times New Roman" w:eastAsia="Times New Roman" w:hAnsi="Times New Roman"/>
-                <w:sz w:val="18"/>
-              </w:rPr>
-              <w:t>Techo</w:t>
-            </w:r>
-          </w:p>
-        </w:tc>
-        <w:tc>
-          <w:tcPr>
-            <w:tcW w:w="6690" w:type="dxa"/>
-            <w:tcBorders>
-              <w:top w:val="single" w:sz="4" w:space="0" w:color="BFBFBF"/>
-              <w:left w:val="single" w:sz="4" w:space="0" w:color="BFBFBF"/>
-              <w:bottom w:val="single" w:sz="4" w:space="0" w:color="BFBFBF"/>
-              <w:right w:val="single" w:sz="4" w:space="0" w:color="BFBFBF"/>
-            </w:tcBorders>
-            <w:vAlign w:val="center"/>
-          </w:tcPr>
-          <w:p>
-            <w:pPr>
-              <w:spacing w:before="40" w:after="40" w:line="252" w:lineRule="auto"/>
-            </w:pPr>
-            <w:r>
-              <w:rPr>
-                <w:rFonts w:ascii="Times New Roman" w:eastAsia="Times New Roman" w:hAnsi="Times New Roman"/>
-                <w:sz w:val="18"/>
-              </w:rPr>
-              <w:t>US$ 20.700. La contingencia del 12 % solo se abre con una razón escrita</w:t>
+            <w:vAlign w:val="center"/>
+          </w:tcPr>
+          <w:p>
+            <w:pPr>
+              <w:spacing w:before="40" w:after="40" w:line="252" w:lineRule="auto"/>
+            </w:pPr>
+            <w:r>
+              <w:rPr>
+                <w:rFonts w:ascii="Times New Roman" w:eastAsia="Times New Roman" w:hAnsi="Times New Roman"/>
+                <w:sz w:val="18"/>
+              </w:rPr>
+              <w:t xml:space="preserve">US$ 20.700 (techo aprobado). La contingencia del 10 % (US$ 1.890 sobre la base de US$ 18.810) solo se abre con una razón escrita</w:t>
             </w:r>
           </w:p>
         </w:tc>
@@ -895,7 +841,14 @@
           <w:rFonts w:ascii="Times New Roman" w:eastAsia="Times New Roman" w:hAnsi="Times New Roman"/>
           <w:sz w:val="24"/>
         </w:rPr>
-        <w:t>Kiran es la plataforma de un emprendimiento social. El producto cubre cuatro piezas: el inventario de kits, el tablero operativo, los tickets de mantención y el reporte de impacto. No instala paneles solares. El trabajo se ejecuta entre el 14 de septiembre de 2026 y el 9 de diciembre de 2026, con un techo de US$ 20.700. La contingencia del 12 % no es un segundo techo: solo se usa si existe una razón escrita. Los cortes comprometidos son el 19 de octubre (inventario validado), el 9 de noviembre (tablero operativo), el 4 de diciembre (tickets, pruebas y primer reporte) y el tramo del 5 al 9 de diciembre (cierre y entrega).</w:t>
+        <w:t xml:space="preserve">Kiran es la plataforma de un emprendimiento social. El producto cubre cuatro piezas: el inventario de kits, el tablero operativo, los tickets de mantención y el reporte de impacto. No instala paneles solares. El trabajo se ejecuta entre el 14 de septiembre de 2026 y el 9 de diciembre de 2026, con un techo de US$ 20.700. La contingencia del 10 % (US$ 1.890 sobre la base de US$ 18.810)</w:t>
+      </w:r>
+      <w:r>
+        <w:rPr>
+          <w:rFonts w:ascii="Times New Roman" w:eastAsia="Times New Roman" w:hAnsi="Times New Roman"/>
+          <w:sz w:val="24"/>
+        </w:rPr>
+        <w:t xml:space="preserve"> no es un segundo techo: solo se usa si existe una razón escrita. Los cortes comprometidos son el 19 de octubre (inventario validado), el 9 de noviembre (tablero operativo), el 4 de diciembre (tickets, pruebas y primer informe de impacto) y el tramo del 5 al 9 de diciembre (cierre y entrega).</w:t>
       </w:r>
     </w:p>
     <w:p>
@@ -909,7 +862,7 @@
           <w:rFonts w:ascii="Times New Roman" w:eastAsia="Times New Roman" w:hAnsi="Times New Roman"/>
           <w:sz w:val="24"/>
         </w:rPr>
-        <w:t>El equipo es el ya definido para el caso. Giannina Guerrero tiene la dirección y el frontend. Nicolás Barra tiene el backend. Ari Araya tiene la nube. Skarlett Tropan tiene la calidad. No se incorpora otra persona para absorber un cambio.</w:t>
+        <w:t>El equipo es el ya definido para el caso. Giannina Guerrero está a cargo de la dirección del proyecto y el frontend; Nicolás Barra, del backend e inventario; Ari Araya, de la infraestructura y nube, y Skarlett Tropan, de la calidad e impacto. No se incorpora otra persona para absorber un cambio.</w:t>
       </w:r>
     </w:p>
     <w:p>
@@ -923,7 +876,7 @@
           <w:rFonts w:ascii="Times New Roman" w:eastAsia="Times New Roman" w:hAnsi="Times New Roman"/>
           <w:sz w:val="24"/>
         </w:rPr>
-        <w:t>El indicador 2.2 pide gestionar el cambio sin que el plan inicial deje de describir el compromiso real. Un cambio que se construye y no actualiza el alcance ni las fechas deja dos proyectos: el que está en el código y el que está en el plan. Este documento aplica un solo procedimiento a seis cambios potenciales del caso. Primero se identifica la solicitud y se decide si amerita trato de cambio. Si amerita, se informa y se registra. Después se evalúa el impacto, el costo, el tiempo y la factibilidad, incluidos los riesgos. Solo entonces se aprueba, se rechaza o se reemplaza por una medida factible. Lo aprobado se implementa con pasos, responsable y plazo, y queda en seguimiento. Lo que no es factible no se fuerza: se cierra esa formulación y, cuando corresponde, queda una medida distinta.</w:t>
+        <w:t>El indicador 2.2 pide gestionar el cambio sin que el plan inicial deje de describir el compromiso real. Si un cambio se construye sin actualizar el alcance ni las fechas, el plan deja de reflejar lo que efectivamente se desarrolla. Este documento aplica un solo procedimiento a seis cambios potenciales del caso. Primero se identifica la solicitud y se decide si amerita trato de cambio. Si amerita, se informa y se registra. Después se evalúa el impacto, el costo, el tiempo y la factibilidad, incluidos los riesgos. Solo entonces se aprueba, se rechaza o se reemplaza por una medida factible. Lo aprobado se implementa con pasos, responsable y plazo, y queda en seguimiento. Cuando una solicitud no es factible, se cierra esa formulación y, cuando corresponde, queda una medida distinta.</w:t>
       </w:r>
     </w:p>
     <w:p>
@@ -937,8 +890,7 @@
           <w:rFonts w:ascii="Times New Roman" w:eastAsia="Times New Roman" w:hAnsi="Times New Roman"/>
           <w:sz w:val="24"/>
         </w:rPr>
-        <w:lastRenderedPageBreak/>
-        <w:t>La prioridad no sale de la insistencia de la solicitud. Sale del valor para los cortes ya comprometidos y de la urgencia real: qué corte se rompe si el cambio espera, y qué corte se rompe si el cambio entra. Cuando dos cambios caben en el mismo cuadrante y no caben los dos en el equipo, desempata el costo. El seguimiento usa los controles ya definidos para Kiran, no un tablero nuevo.</w:t>
+        <w:t>La prioridad de cada solicitud se define por su valor para los cortes ya comprometidos y por su urgencia: qué corte se rompe si el cambio espera, y qué corte se rompe si el cambio entra. Cuando dos cambios caben en el mismo cuadrante y no caben los dos en el equipo, desempata el costo. El seguimiento usa los controles ya definidos para Kiran, no un tablero nuevo.</w:t>
       </w:r>
     </w:p>
     <w:p>
@@ -952,7 +904,7 @@
           <w:rFonts w:ascii="Times New Roman" w:hAnsi="Times New Roman"/>
           <w:sz w:val="24"/>
         </w:rPr>
-        <w:t>C-05 y C-06 no suman encima de la fotografía, el segundo punto de inventario y el servicio externo en el mismo sprint: compiten por las mismas dos tarjetas por persona. Si entra uno, sale una historia equivalente. Además, C-05b implica caja nueva (Gemini + Google Cloud) que el plan inicial no tenía como partida: por eso este documento analiza la reasignación, el uso de contingencia y el redimensionamiento del techo. Un lakehouse enterprise sin CC, un especialista agéntico externo o una IA de monitoreo de flota no entran en esta ventana. El datalake se reconoce como base de información a cargo de Nicolás y Ari (mínimo usable con C-05b; lakehouse completo solo con CC).</w:t>
+        <w:t>C-05 y C-06 no suman encima de la fotografía, el segundo punto de inventario y el servicio externo en el mismo sprint: compiten por las mismas dos tarjetas por persona. Si entra uno, sale una historia equivalente. Además, C-05b implica caja nueva (Gemini + Google Cloud) que el plan inicial no tenía como partida: por eso este documento analiza la reasignación, el uso de contingencia y el redimensionamiento del techo. Un lago de datos empresarial sin control de cambios, un especialista agéntico externo o una IA de monitoreo de flota no entran en esta ventana. El datalake se reconoce como base de información a cargo de Nicolás y Ari (mínimo usable con C-05b; lago de datos completo solo con CC).</w:t>
       </w:r>
     </w:p>
     <w:p>
@@ -1419,7 +1371,7 @@
                 <w:rFonts w:ascii="Times New Roman" w:eastAsia="Times New Roman" w:hAnsi="Times New Roman"/>
                 <w:sz w:val="18"/>
               </w:rPr>
-              <w:t>Se pide producir el primer reporte de impacto mediante un servicio externo de pago, en lugar del trabajo del equipo.</w:t>
+              <w:t>Se pide producir el primer informe de impacto mediante un servicio externo de pago, en lugar del trabajo del equipo.</w:t>
             </w:r>
           </w:p>
         </w:tc>
@@ -1963,7 +1915,7 @@
           <w:rFonts w:ascii="Times New Roman" w:eastAsia="Times New Roman" w:hAnsi="Times New Roman"/>
           <w:sz w:val="24"/>
         </w:rPr>
-        <w:t>No se registra como cambio una consulta que no modifica el corte, ni una mejora de redacción del reporte que quepa en la historia ya comprometida, ni una exploración de herramientas. Esas situaciones no ameritan el procedimiento: cerrarlas aquí impide que compitan con el inventario, el tablero y los tickets. Tampoco se abre un cambio para ampliar Kiran a la instalación de paneles. Eso no es una variación del proyecto; es otro proyecto. Explorar «IA generativa en producción» o un datalake corporativo sin registro no entra. Un ranking automático sin aprobación, o un lago de datos con pipelines y BI dedicado, es solicitud nueva y se trata como C-05 o como solicitud futura rechazada en esta ventana, no como ajuste de una historia ya comprometida.</w:t>
+        <w:t>No se registra como cambio una consulta que no modifica el corte, ni una mejora de redacción del reporte que quepa en la historia ya comprometida, ni una exploración de herramientas. Esas situaciones no ameritan el procedimiento: cerrarlas aquí impide que compitan con el inventario, el tablero y los tickets. Tampoco se abre un cambio para ampliar Kiran a la instalación de paneles. Esa solicitud corresponde a otro proyecto y no a una variación de Kiran. Explorar «IA generativa en producción» o un datalake corporativo sin registro no entra. Un ranking automático sin aprobación, o un lago de datos con pipelines y BI dedicado, es solicitud nueva y se trata como C-05 o como solicitud futura rechazada en esta ventana, no como ajuste de una historia ya comprometida.</w:t>
       </w:r>
     </w:p>
     <w:p>
@@ -2024,7 +1976,7 @@
           <w:rFonts w:ascii="Times New Roman" w:eastAsia="Times New Roman" w:hAnsi="Times New Roman"/>
           <w:sz w:val="24"/>
         </w:rPr>
-        <w:t>En los términos pedidos, el cambio toca el modelo del ticket, la interfaz y el almacenamiento de un archivo. Nicolás sostiene el modelo. Giannina sostiene la interfaz. Un archivo de fotografía deja de ser solo interfaz: exige almacenamiento, y ese almacenamiento queda en la nube a cargo de Ari. El corte del 4 de diciembre debe entregar tickets, pruebas y el primer reporte. Sumar la fotografía sin sacar otra historia desplaza la prueba o el reporte hacia la semana del 5 al 9 de diciembre, que es cierre y no construcción. Si el corte se atrasa más de tres días, la semana siguiente no puede absorber ese resto, porque esa semana no agrega trabajo nuevo.</w:t>
+        <w:t>En los términos pedidos, el cambio toca el modelo del ticket, la interfaz y el almacenamiento de un archivo. Nicolás sostiene el modelo. Giannina sostiene la interfaz. Un archivo de fotografía deja de ser solo interfaz: exige almacenamiento, y ese almacenamiento queda en la nube a cargo de Ari. El corte del 4 de diciembre debe entregar tickets, pruebas y el primer informe de impacto. Sumar la fotografía sin sacar otra historia desplaza la prueba o el reporte hacia la semana del 5 al 9 de diciembre, que es cierre y no construcción. Si el corte se atrasa más de tres días, la semana siguiente no puede absorber ese resto, porque esa semana no agrega trabajo nuevo.</w:t>
       </w:r>
     </w:p>
     <w:p>
@@ -2125,7 +2077,7 @@
           <w:rFonts w:ascii="Times New Roman" w:eastAsia="Times New Roman" w:hAnsi="Times New Roman"/>
           <w:sz w:val="24"/>
         </w:rPr>
-        <w:t>El primer reporte ya es parte del corte del 4 de diciembre. Cambiar el medio no cambia el objetivo y sí cambia el costo. Un servicio de pago, sin un monto ya comprometido en el plan, es gasto no comprometido. Este documento no le asigna un precio y no abre la contingencia del 12 %: no hay una razón escrita que justifique ese uso, porque el reporte puede construirse con el trabajo ya previsto. Si la desviación que Ari registra cada dos semanas superara el 10 %, el gasto no comprometido se detiene. Depender de un servicio que puede detenerse a esa altura deja el reporte fuera del cierre.</w:t>
+        <w:t>El primer informe de impacto ya es parte del corte del 4 de diciembre. Cambiar el medio no cambia el objetivo y sí cambia el costo. Un servicio de pago, sin un monto ya comprometido en el plan, es gasto no comprometido. Este documento no le asigna un precio y no abre la contingencia de US$ 1.890: no hay una razón escrita que justifique ese uso, porque el reporte puede construirse con el trabajo ya previsto. Si la desviación que Ari registra cada dos semanas superara el 10 %, el gasto no comprometido se detiene. Depender de un servicio que puede detenerse a esa altura deja el reporte fuera del cierre.</w:t>
       </w:r>
     </w:p>
     <w:p>
@@ -2168,7 +2120,7 @@
           <w:rFonts w:ascii="Times New Roman" w:eastAsia="Times New Roman" w:hAnsi="Times New Roman"/>
           <w:sz w:val="24"/>
         </w:rPr>
-        <w:t>El límite de dos tarjetas por persona y la regla de los cinco días ya existen. El cambio aparece cuando esa regla se ejecuta en silencio: se mueve trabajo de un rol a otro, Project Libre sigue mostrando la asignación anterior y Excel se actualiza con un tablero que no es el trabajo real. El alcance del producto no crece. Crece el desajuste entre el plan y la ejecución, que es justo lo que el indicador 2.2 pide evitar.</w:t>
+        <w:t>El límite de dos tarjetas por persona y la regla de los cinco días ya existen. El cambio aparece cuando esa regla se aplica sin dejar registro: se mueve trabajo de un rol a otro, Project Libre sigue mostrando la asignación anterior y Excel se actualiza con un tablero que no es el trabajo real. El alcance del producto no crece. Crece el desajuste entre el plan y la ejecución, situación que el indicador 2.2 busca evitar.</w:t>
       </w:r>
     </w:p>
     <w:p>
@@ -2218,7 +2170,7 @@
           <w:rFonts w:ascii="Times New Roman" w:hAnsi="Times New Roman"/>
           <w:sz w:val="24"/>
         </w:rPr>
-        <w:t>Responsabilidad técnica (datos e inteligencia): Nicolás Barra y Ari Araya quedan a cargo de Google Cloud, del Agent Development Kit (ADK) para el desarrollo agéntico, y del datalake como base de información del piloto (inventario, tickets, logs de chat y trazas que después alimenten monitoreo y alertas). No se contrata un perfil externo para eso en sep–dic 2026. Giannina mantiene el control de cambios y la UI; Skarlett, la calidad del FAQ y de las respuestas. El datalake se trata como fundamento: en esta ventana se prioriza un depósito mínimo usable (sin PII innecesaria) alineado al chatbot; la ampliación a lakehouse o analítica pesada sigue sujeta a CC y techo (Escenario C u otro).</w:t>
+        <w:t>Responsabilidad técnica (datos e inteligencia): Nicolás Barra y Ari Araya quedan a cargo de Google Cloud, del Agent Development Kit (ADK) para el desarrollo agéntico, y del datalake como base de información del piloto (inventario, tickets, logs de chat y trazas que después alimenten monitoreo y alertas). No se contrata un perfil externo para eso en sep–dic 2026. Giannina mantiene el control de cambios y la UI; Skarlett, la calidad del FAQ y de las respuestas. El datalake se trata como fundamento: en esta ventana se prioriza un depósito mínimo usable (sin PII innecesaria) alineado al chatbot; la ampliación a un lago de datos completo o analítica pesada sigue sujeta a CC y techo (Escenario C u otro).</w:t>
       </w:r>
     </w:p>
     <w:p>
@@ -2324,8 +2276,7 @@
           <w:rFonts w:ascii="Times New Roman" w:eastAsia="Times New Roman" w:hAnsi="Times New Roman"/>
           <w:sz w:val="24"/>
         </w:rPr>
-        <w:lastRenderedPageBreak/>
-        <w:t>pruebas y reporte, y la semana siguiente es de cierre. El equipo tiene cuatro roles y dos tarjetas por persona. La situación compleja del caso no es un cambio aislado: es la suma. El plan inicial se mantiene si entra, como máximo, la medida reducida de C-01 y la regla de C-04. Las otras dos solicitudes quedan en el registro precisamente para que no reaparezcan como trabajo informal. Aceptar además un datalake completo y un copiloto de IA «todo en uno» no son mejoras independientes: caen sobre el mismo techo, el mismo equipo y los mismos cortes. Un datalake o lakehouse (ingesta, catálogo, ETL, BI dedicado) queda fuera del 100 % de la EDT del piloto: se rechaza o se difiere post cierre. La línea base de datos sigue siendo la base del aplicativo más el export para el reporte del 4 de diciembre. Un depósito mínimo de logs agregados sin PII, si alguien lo pide, solo cabe condicionado y dentro del hosting variable, sin competir con C-06. C-05 fase 1 (chatbot FAQ + canal) y C-06 solo entran si reemplazan historia y respetan dos tarjetas por persona. Hay que evitar acumular superficie de producto sin capacidad de integración y prueba. El datalake, no obstante, se reconoce como base de información importante para el chatbot, el soporte y el monitoreo futuro: queda a cargo de Nicolás y Ari. En esta ventana se apunta a un depósito mínimo usable; el lakehouse completo no se aprueba sin CC y financiamiento.</w:t>
+        <w:t>pruebas y reporte, y la semana siguiente es de cierre. El equipo tiene cuatro roles y dos tarjetas por persona. La complejidad del caso proviene de la suma de las solicitudes y no de un cambio aislado. El plan inicial se mantiene si entra, como máximo, la medida reducida de C-01 y la regla de C-04. Las otras dos solicitudes quedan en el registro precisamente para que no reaparezcan como trabajo informal. Aceptar además un datalake completo y un copiloto de IA «todo en uno» no son mejoras independientes: caen sobre el mismo techo, el mismo equipo y los mismos cortes. Un lago de datos completo (ingesta, catálogo, ETL, BI dedicado) queda fuera del 100 % de la EDT del piloto: se rechaza o se difiere post cierre. La línea base de datos sigue siendo la base del aplicativo más el export para el reporte del 4 de diciembre. Un depósito mínimo de logs agregados sin PII, si alguien lo pide, solo cabe condicionado y dentro del hosting variable, sin competir con C-06. C-05 fase 1 (chatbot FAQ + canal) y C-06 solo entran si reemplazan historia y respetan dos tarjetas por persona. Hay que evitar acumular superficie de producto sin capacidad de integración y prueba. El datalake, no obstante, se reconoce como base de información importante para el chatbot, el soporte y el monitoreo futuro: queda a cargo de Nicolás y Ari. En esta ventana se apunta a un depósito mínimo usable; el lago de datos completo no se aprueba sin CC y financiamiento.</w:t>
       </w:r>
     </w:p>
     <w:p>
@@ -4081,7 +4032,7 @@
                 <w:rFonts w:ascii="Times New Roman" w:eastAsia="Times New Roman" w:hAnsi="Times New Roman"/>
                 <w:sz w:val="18"/>
               </w:rPr>
-              <w:t>Nicolás pasa las líneas cambiadas a Skarlett al cierre del sprint. Sin código, la celda queda «sin base» y no es alerta roja. Meta: 5 o menos, y cero bloqueos abiertos.</w:t>
+              <w:t>Nicolás pasa las líneas cambiadas a Skarlett al cierre del sprint. Como el código se desarrolla desde el 14 de septiembre, cada sprint tiene líneas cambiadas que medir. Meta: 5 o menos, y cero bloqueos abiertos.</w:t>
             </w:r>
           </w:p>
         </w:tc>
@@ -4174,7 +4125,7 @@
                 <w:rFonts w:ascii="Times New Roman" w:eastAsia="Times New Roman" w:hAnsi="Times New Roman"/>
                 <w:sz w:val="18"/>
               </w:rPr>
-              <w:t>Solo fase 1: FAQ más escalamiento humano. Un salto de fase es solicitud nueva. El análisis de impacto lo revisa un rol senior (Ari o Nicolás), no un junior en planificación ni en control de cambios.</w:t>
+              <w:t>Solo fase 1: FAQ más escalamiento humano. Un salto de fase es solicitud nueva. El análisis de impacto lo revisan Ari Araya y Nicolás Barra, responsables técnicos de Google Cloud y del depósito de datos.</w:t>
             </w:r>
           </w:p>
         </w:tc>
@@ -4209,7 +4160,7 @@
                 <w:rFonts w:ascii="Times New Roman" w:eastAsia="Times New Roman" w:hAnsi="Times New Roman"/>
                 <w:sz w:val="18"/>
               </w:rPr>
-              <w:t>El costo de API o un datalake come el techo.</w:t>
+              <w:t>El costo de API o del datalake supera el techo.</w:t>
             </w:r>
           </w:p>
         </w:tc>
@@ -4529,8 +4480,7 @@
           <w:rFonts w:ascii="Times New Roman" w:eastAsia="Times New Roman" w:hAnsi="Times New Roman"/>
           <w:sz w:val="24"/>
         </w:rPr>
-        <w:lastRenderedPageBreak/>
-        <w:t>entregar tickets, pruebas y primer reporte. La lista contra la cual Nicolás revisa el 80 % es la lista ya reemplazada: lo que no se alcanza vuelve al backlog y no se le suma este cambio encima. Las líneas cambiadas pasan a Skarlett. Si la medida no cabe bajo el límite de dos tarjetas por persona, no entra. En ese caso también se cierra, y el ticket del corte permanece como estaba planificado.</w:t>
+        <w:t>entregar tickets, pruebas y primer informe de impacto. La lista contra la cual Nicolás revisa el 80 % es la lista ya reemplazada: lo que no se alcanza vuelve al backlog y no se le suma este cambio encima. Las líneas cambiadas pasan a Skarlett. Si la medida no cabe bajo el límite de dos tarjetas por persona, no entra. En ese caso también se cierra, y el ticket del corte permanece como estaba planificado.</w:t>
       </w:r>
     </w:p>
     <w:p>
@@ -4586,7 +4536,7 @@
           <w:rFonts w:ascii="Times New Roman" w:hAnsi="Times New Roman"/>
           <w:sz w:val="24"/>
         </w:rPr>
-        <w:t>C-05 se aprueba solo por fases. La fase 1 (chatbot con FAQ y canal de asistencia que escala a ticket o a persona, sobre una UI/UX clara) queda condicionada a que C-06 esté en marcha o en el mismo plan de sprint, a que quepa en dos tarjetas por persona y a un tope de llamadas API en Excel. El FAQ lo cura el equipo; el chatbot no cierra ni cambia estados solo. Se prioriza frente a monitoreo y alertas porque la contingencia de la zona y el público objetivo exigen buen soporte y un uso guiado: eso es lo que permite ahorrar en personal de soporte. La fase 2 (ampliar el corpus FAQ, mejorar el enrutamiento del canal y, si cabe, dejar trazas de casos de usuario para uso interno) solo post 4 de diciembre o con un control de cambios nuevo. La fase 3 (monitoreo y alertas operativas asistidas por IA sobre los equipos, app ciudadana masiva, reemplazo total del personal de soporte o modelo propio) se rechaza entre septiembre y diciembre de 2026 y queda como solicitud futura. No se aprueba un chatbot que sustituya de golpe al soporte contratado ni una IA de monitoreo total en esta ventana. El financiamiento de la fase 1 exige decisión explícita: Escenario C (techo US$ 21.200, recomendado), Escenario B (contingencia con acta) o rechazo. No se construye asumiendo que «entra en los 20.700» sin desglose. En lo técnico de datos e inteligencia (Google Cloud, ADK y datalake como base de información), los responsables son Nicolás Barra y Ari Araya; no se incorpora especialista externo en esta ventana.</w:t>
+        <w:t>C-05 se aprueba solo por fases. La fase 1 (chatbot con FAQ y canal de asistencia que escala a ticket o a persona, sobre una UI/UX clara) queda condicionada a que C-06 esté en marcha o en el mismo plan de sprint, a que quepa en dos tarjetas por persona y a un tope de llamadas API en Excel. El FAQ lo cura el equipo; el chatbot no cierra ni cambia estados solo. Se prioriza frente a monitoreo y alertas porque la contingencia de la zona y el público objetivo exigen buen soporte y un uso guiado: eso es lo que permite ahorrar en personal de soporte. La fase 2 (ampliar el corpus FAQ, mejorar el enrutamiento del canal y, si cabe, dejar trazas de casos de usuario para uso interno) solo post 4 de diciembre o con un control de cambios nuevo. La fase 3 (monitoreo y alertas operativas asistidas por IA sobre los equipos, app ciudadana masiva, reemplazo total del personal de soporte o modelo propio) se rechaza entre septiembre y diciembre de 2026 y queda como solicitud futura. No se aprueba un chatbot que sustituya de golpe al soporte contratado ni una IA de monitoreo total en esta ventana. El financiamiento de la fase 1 exige decisión explícita: Escenario C (techo solicitado de US$ 21.040, recomendado), Escenario B (contingencia con acta) o rechazo. No se construye asumiendo que «entra en los 20.700» sin desglose. En lo técnico de datos e inteligencia (Google Cloud, ADK y datalake como base de información), los responsables son Nicolás Barra y Ari Araya; no se incorpora especialista externo en esta ventana.</w:t>
       </w:r>
     </w:p>
     <w:p>
@@ -6794,7 +6744,7 @@
                 <w:rFonts w:ascii="Times New Roman" w:eastAsia="Times New Roman" w:hAnsi="Times New Roman"/>
                 <w:sz w:val="18"/>
               </w:rPr>
-              <w:t>Aprobada condicionada a C-06, WIP, FAQ curado y financiamiento explícito (Escenario C: techo US$ 21.200, o B con acta de contingencia). Fases 2–3 no. El bot no cierra ni cambia estados solo.</w:t>
+              <w:t>Aprobada condicionada a C-06, WIP, FAQ curado y financiamiento explícito (Escenario C: techo solicitado de US$ 21.040, o B con acta de contingencia). Fases 2–3 no. El bot no cierra ni cambia estados solo.</w:t>
             </w:r>
           </w:p>
         </w:tc>
@@ -6878,7 +6828,7 @@
                 <w:rFonts w:ascii="Times New Roman" w:eastAsia="Times New Roman" w:hAnsi="Times New Roman"/>
                 <w:sz w:val="18"/>
               </w:rPr>
-              <w:t>Sí, a la dirección: ampliar techo a US$ 21.200, o abrir contingencia, o rechazar C-05b. No construir contra el techo viejo sin esa decisión.</w:t>
+              <w:t>Sí, a la dirección: aprobar el techo solicitado de US$ 21.040, o abrir contingencia, o rechazar C-05b. Sin esa decisión, no se construye con cargo al techo aprobado.</w:t>
             </w:r>
           </w:p>
         </w:tc>
@@ -7193,7 +7143,7 @@
           <w:rFonts w:ascii="Times New Roman" w:eastAsia="Times New Roman" w:hAnsi="Times New Roman"/>
           <w:sz w:val="24"/>
         </w:rPr>
-        <w:t>Aprobar no es lo mismo que dejar el registro en curso, ni lo mismo que cerrarlo. Cerrado significa que esa formulación terminó su ciclo: C-01 en su parte de archivo y C-03. Abierto significa que la decisión está tomada y la construcción no ha empezado. Ninguna fila nace en curso, La construcción no ha empezado, y el registro no la da por iniciada. C-05a y la formulación amplia de datalake quedan cerradas. C-05b y C-06 quedan abiertas y condicionadas.</w:t>
+        <w:t>Aprobar no es lo mismo que dejar el registro en curso, ni lo mismo que cerrarlo. Cerrado significa que esa formulación terminó su ciclo: C-01 en su parte de archivo y C-03. Abierto significa que la decisión está tomada y la construcción no ha empezado. Ninguna fila se registra «en curso», porque la construcción no ha empezado y el registro no la da por iniciada. C-05a y la formulación amplia de datalake quedan cerradas. C-05b y C-06 quedan abiertas y condicionadas.</w:t>
       </w:r>
     </w:p>
     <w:p>
@@ -7796,7 +7746,7 @@
                 <w:rFonts w:ascii="Times New Roman" w:eastAsia="Times New Roman" w:hAnsi="Times New Roman"/>
                 <w:sz w:val="18"/>
               </w:rPr>
-              <w:t>Ari no registra un servicio nuevo. La contingencia del 12 % sigue cerrada. Desviación sobre el 10 %: se detiene el gasto no comprometido.</w:t>
+              <w:t>Ari no registra un servicio nuevo. La contingencia de US$ 1.890 (10 % de la base) sigue cerrada. Desviación sobre el 10 %: se detiene el gasto no comprometido.</w:t>
             </w:r>
           </w:p>
         </w:tc>
@@ -8143,7 +8093,7 @@
                 <w:rFonts w:ascii="Times New Roman" w:eastAsia="Times New Roman" w:hAnsi="Times New Roman"/>
                 <w:sz w:val="18"/>
               </w:rPr>
-              <w:t>Se agrega chatbot en la plataforma: corpus FAQ, ventana de chat y escalamiento a ticket o a persona de soporte. Esfuerzo orientativo: cuatro a seis días-persona de integración y dos a tres de calidad del FAQ. No cambia estados del kit solo.</w:t>
+              <w:t>Se agrega chatbot en la plataforma: corpus FAQ, ventana de chat y escalamiento a ticket o a persona de soporte. Esfuerzo orientativo: nueve a quince días-persona (dos a tres de interfaz del chat, cuatro a seis de integración, dos a cuatro de calidad del FAQ y uno a dos de ambiente y tope de gasto). No cambia estados del kit solo.</w:t>
             </w:r>
           </w:p>
         </w:tc>
@@ -8230,7 +8180,7 @@
                 <w:rFonts w:ascii="Times New Roman" w:eastAsia="Times New Roman" w:hAnsi="Times New Roman"/>
                 <w:sz w:val="18"/>
               </w:rPr>
-              <w:t>Ari crea partidas Gemini y Google Cloud solo si hay Escenario C (techo 21.200) o B (contingencia con acta). Registra gasto real y lo compara con ahorro de soporte (línea base). Sin decisión de financiamiento: sin despliegue. Detalle en Tablas 7b y 7c.</w:t>
+              <w:t>Ari crea partidas Gemini y Google Cloud solo si hay Escenario C (techo solicitado de US$ 21.040) o B (contingencia con acta). Registra gasto real y lo compara con ahorro de soporte (línea base). Sin decisión de financiamiento: sin despliegue. Detalle en Tablas 7b y 7c.</w:t>
             </w:r>
           </w:p>
         </w:tc>
@@ -8902,7 +8852,7 @@
                 <w:color w:val="000000" w:themeColor="text1"/>
                 <w:sz w:val="18"/>
               </w:rPr>
-              <w:t>Módulo chat + depósito mínimo de información (Nicolás/Ari). Sin lakehouse enterprise. Sin GPU.</w:t>
+              <w:t>Módulo chat + depósito mínimo de información (Nicolás/Ari). Sin lago de datos empresarial. Sin GPU.</w:t>
             </w:r>
           </w:p>
         </w:tc>
@@ -9474,7 +9424,14 @@
           <w:rFonts w:ascii="Times New Roman" w:hAnsi="Times New Roman"/>
           <w:sz w:val="20"/>
         </w:rPr>
-        <w:t xml:space="preserve"> — Contingencia con razón escrita: se abre parte de los US$ 1.890 de contingencia (12 %) para el costo variable del chatbot. El techo nominal sigue en US$ 20.700, pero baja la reserva pensada para alargue de terreno u hosting. Exige acta de razón y fila en el registro de riesgos.</w:t>
+        <w:t xml:space="preserve"> — Contingencia con razón escrita: se abre parte de los US$ 1.890 de contingencia (10 % de la base de US$ 18.810)</w:t>
+      </w:r>
+      <w:r>
+        <w:rPr>
+          <w:rFonts w:ascii="Times New Roman" w:hAnsi="Times New Roman"/>
+          <w:sz w:val="20"/>
+        </w:rPr>
+        <w:t xml:space="preserve"> para el costo variable del chatbot. El techo nominal sigue en US$ 20.700, pero baja la reserva pensada para alargue de terreno u hosting. Exige acta de razón y fila en el registro de riesgos.</w:t>
       </w:r>
     </w:p>
     <w:p>
@@ -9496,7 +9453,7 @@
           <w:rFonts w:ascii="Times New Roman" w:hAnsi="Times New Roman"/>
           <w:sz w:val="20"/>
         </w:rPr>
-        <w:t xml:space="preserve"> — Redimensionar el techo (recomendado): se solicita ampliar el techo autorizado de US$ 20.700 a US$ 21.200 (+ US$ 500) para cubrir Gemini, Google Cloud, colchón de uso e integración, sin vaciar el presupuesto de soporte local. C-05b queda aprobado solo condicionado a esa ampliación (o, en su defecto, al Escenario B con acta). Mientras dirección no decida, no se construye el chatbot «en silencio» contra el techo viejo.</w:t>
+        <w:t xml:space="preserve"> — Redimensionar el techo (recomendado): se solicita elevar el techo aprobado de US$ 20.700 a un techo solicitado de US$ 21.040 (+ US$ 340, el máximo de caja de la Tabla 7b) para cubrir Gemini, Google Cloud y el colchón de uso e integración, sin vaciar el presupuesto de soporte local. Los 13 a 22 días-persona de C-05b + C-06 no suman caja: se cubren con sustitución de alcance. C-05b queda aprobado solo condicionado a esa ampliación (o, en su defecto, al Escenario B con acta). Mientras dirección no decida, el chatbot no se construye con cargo al techo aprobado de US$ 20.700.</w:t>
       </w:r>
     </w:p>
     <w:tbl>
@@ -9965,7 +9922,7 @@
                 <w:rFonts w:ascii="Times New Roman" w:eastAsia="Times New Roman" w:hAnsi="Times New Roman"/>
                 <w:sz w:val="18"/>
               </w:rPr>
-              <w:t>US$ 21.200 (+500)</w:t>
+              <w:t>US$ 21.040 (+340)</w:t>
             </w:r>
           </w:p>
         </w:tc>
@@ -10053,8 +10010,7 @@
           <w:rFonts w:ascii="Times New Roman" w:hAnsi="Times New Roman"/>
           <w:sz w:val="20"/>
         </w:rPr>
-        <w:lastRenderedPageBreak/>
-        <w:t>Tabla 7c. Escenarios de financiamiento de C-05b. El equipo recomienda el Escenario C (techo US$ 21.200).</w:t>
+        <w:t>Tabla 7c. Escenarios de financiamiento de C-05b. El equipo recomienda el Escenario C (techo solicitado de US$ 21.040).</w:t>
       </w:r>
     </w:p>
     <w:p>
@@ -10503,7 +10459,7 @@
                 <w:bCs/>
                 <w:sz w:val="18"/>
               </w:rPr>
-              <w:t>0 caja HH (~5–8 pd) + setup GCloud (~US$ 40–80 si hay cuotas de alta)</w:t>
+              <w:t>0 caja HH (~5–8 pd) + setup GCloud (~US$ 40–80 si hay cuotas de alta, dentro de la partida Google Cloud de la Tabla 7b)</w:t>
             </w:r>
           </w:p>
         </w:tc>
@@ -11283,7 +11239,7 @@
                 <w:bCs/>
                 <w:sz w:val="18"/>
               </w:rPr>
-              <w:t>80–120 dentro del +500 del techo 21.200</w:t>
+              <w:t>80–120 dentro del +340 del techo solicitado de US$ 21.040</w:t>
             </w:r>
           </w:p>
         </w:tc>
@@ -11313,7 +11269,7 @@
                 <w:bCs/>
                 <w:sz w:val="18"/>
               </w:rPr>
-              <w:t>Amortigua picos de uso sin inventar un segundo techo informal</w:t>
+              <w:t>Amortigua picos de uso sin crear un segundo techo informal</w:t>
             </w:r>
           </w:p>
         </w:tc>
@@ -11372,7 +11328,7 @@
           <w:rFonts w:ascii="Times New Roman" w:hAnsi="Times New Roman"/>
           <w:sz w:val="20"/>
         </w:rPr>
-        <w:t>Mensaje al cliente: aprobar C-05b en Escenario C (techo US$ 21.200) autoriza un CAPEX de puesta en marcha (trabajo del equipo ya en plan, más setup GCloud) y un OPEX acotado de Gemini y Google Cloud, medido cada dos semanas. El beneficio esperado es reducir OPEX de soporte informal; eso se comprueba con la línea base post 9 de noviembre, no se promete como ahorro fijo en el acta. Las fases posteriores (monitoreo, alertas, IA de flota) serían OPEX/CAPEX nuevos y exigen otro control de cambios. El datalake como base de información, el ADK y Google Cloud los ejecutan Nicolás y Ari dentro del equipo.</w:t>
+        <w:t>Mensaje al cliente: aprobar C-05b en Escenario C (techo solicitado de US$ 21.040) autoriza un CAPEX de puesta en marcha (trabajo del equipo ya en plan, más setup GCloud) y un OPEX acotado de Gemini y Google Cloud, medido cada dos semanas. El beneficio esperado es reducir OPEX de soporte informal; eso se comprueba con la línea base post 9 de noviembre, no se promete como ahorro fijo en el acta. Las fases posteriores (monitoreo, alertas, IA de flota) serían OPEX/CAPEX nuevos y exigen otro control de cambios. El datalake como base de información, el ADK y Google Cloud los ejecutan Nicolás y Ari dentro del equipo.</w:t>
       </w:r>
     </w:p>
     <w:p>
@@ -11600,7 +11556,13 @@
                 <w:rFonts w:ascii="Times New Roman" w:eastAsia="Times New Roman" w:hAnsi="Times New Roman"/>
                 <w:sz w:val="18"/>
               </w:rPr>
-              <w:t>Al quedar vigente este plan, y en todo caso antes del 19 de octubre de 2026.</w:t>
+              <w:t>Al quedar vigente este plan. El registro se actualizó antes del corte del 19 de octubre de 2026.</w:t>
+            </w:r>
+            <w:r>
+              <w:rPr>
+                <w:rFonts w:ascii="Times New Roman" w:eastAsia="Times New Roman" w:hAnsi="Times New Roman"/>
+                <w:sz w:val="18"/>
+              </w:rPr>
             </w:r>
           </w:p>
         </w:tc>
@@ -12472,7 +12434,7 @@
                 <w:rFonts w:ascii="Times New Roman" w:eastAsia="Times New Roman" w:hAnsi="Times New Roman"/>
                 <w:sz w:val="18"/>
               </w:rPr>
-              <w:t>No abrir la fase 2 del chatbot, ni app ciudadana, ni un datalake completo sin un control de cambios nuevo y revisión de un rol senior.</w:t>
+              <w:t>No abrir la fase 2 del chatbot, ni app ciudadana, ni un datalake completo sin un control de cambios nuevo y sin revisión de Ari Araya y Nicolás Barra como responsables técnicos.</w:t>
             </w:r>
           </w:p>
         </w:tc>
@@ -12956,7 +12918,7 @@
                 <w:rFonts w:ascii="Times New Roman" w:eastAsia="Times New Roman" w:hAnsi="Times New Roman"/>
                 <w:sz w:val="18"/>
               </w:rPr>
-              <w:t>Tickets, pruebas y primer reporte</w:t>
+              <w:t>Tickets, pruebas y primer informe de impacto</w:t>
             </w:r>
           </w:p>
         </w:tc>
@@ -13012,7 +12974,7 @@
                 <w:rFonts w:ascii="Times New Roman" w:eastAsia="Times New Roman" w:hAnsi="Times New Roman"/>
                 <w:sz w:val="18"/>
               </w:rPr>
-              <w:t>Tickets, pruebas y primer reporte a cargo del equipo.</w:t>
+              <w:t>Tickets, pruebas y primer informe de impacto a cargo del equipo.</w:t>
             </w:r>
           </w:p>
         </w:tc>
@@ -13270,7 +13232,7 @@
           <w:rFonts w:ascii="Times New Roman" w:eastAsia="Times New Roman" w:hAnsi="Times New Roman"/>
           <w:sz w:val="24"/>
         </w:rPr>
-        <w:t>–  El indicador de defectos es la cantidad de defectos del período sobre las líneas cambiadas. La meta es 5 o menos, con cero bloqueos abiertos. Sin código, la celda queda «sin base» y no se trata como alerta roja. Ese indicador es O1 dentro del bloque operativo. Sin código, la celda «sin base» no es alerta roja.</w:t>
+        <w:t>–  El indicador de defectos es la cantidad de defectos encontrados en el período por cada 1.000 líneas cambiadas. La meta es de 5 o menos defectos por cada 1.000 líneas cambiadas, con cero defectos bloqueantes abiertos al corte. El código se desarrolla desde el 14 de septiembre, de modo que cada período tiene líneas cambiadas y el indicador se calcula sobre código real, sin estimaciones. Ese indicador es O1 dentro del bloque operativo.</w:t>
       </w:r>
     </w:p>
     <w:p>
@@ -13298,7 +13260,7 @@
           <w:rFonts w:ascii="Times New Roman" w:eastAsia="Times New Roman" w:hAnsi="Times New Roman"/>
           <w:sz w:val="24"/>
         </w:rPr>
-        <w:t>–  Ari registra el gasto cada dos semanas. Sobre el 10 % de desviación se detiene el gasto no comprometido. El techo de US$ 20.700 y la contingencia del 12 %, cerrada salvo razón escrita, no se modifican porque un indicador se desvíe. La desviación detiene el gasto no comprometido. No autoriza otro techo.</w:t>
+        <w:t>–  Ari registra el gasto cada dos semanas. Sobre el 10 % de desviación se detiene el gasto no comprometido. El techo de US$ 20.700 y la contingencia de US$ 1.890 (10 % de la base), cerrada salvo razón escrita, no se modifican porque un indicador se desvíe. La desviación detiene el gasto no comprometido. No autoriza otro techo.</w:t>
       </w:r>
     </w:p>
     <w:p>
@@ -13976,7 +13938,7 @@
                 <w:rFonts w:ascii="Times New Roman" w:eastAsia="Times New Roman" w:hAnsi="Times New Roman"/>
                 <w:sz w:val="18"/>
               </w:rPr>
-              <w:t>Desviación vs techo vigente (20.700; 21.200 si Escenario C). Freno &gt; 10 %</w:t>
+              <w:t>Desviación vs techo vigente (20.700; 21.040 si Escenario C). Freno &gt; 10 %</w:t>
             </w:r>
           </w:p>
         </w:tc>
@@ -14434,7 +14396,7 @@
                 <w:rFonts w:ascii="Times New Roman" w:eastAsia="Times New Roman" w:hAnsi="Times New Roman"/>
                 <w:sz w:val="18"/>
               </w:rPr>
-              <w:t>Defectos / líneas cambiadas</w:t>
+              <w:t>Defectos por cada 1.000 líneas cambiadas</w:t>
             </w:r>
           </w:p>
         </w:tc>
@@ -14458,7 +14420,7 @@
                 <w:rFonts w:ascii="Times New Roman" w:eastAsia="Times New Roman" w:hAnsi="Times New Roman"/>
                 <w:sz w:val="18"/>
               </w:rPr>
-              <w:t>Defectos ÷ líneas. Meta ≤ 5; 0 bloqueos. Sin código: «sin base»</w:t>
+              <w:t>Defectos encontrados / líneas cambiadas × 1.000. Meta ≤ 5 defectos por cada 1.000 líneas cambiadas; 0 bloqueantes abiertos al corte. Se calcula sobre el código real, desarrollado desde el 14 de septiembre</w:t>
             </w:r>
           </w:p>
         </w:tc>
@@ -16461,7 +16423,7 @@
                 <w:rFonts w:ascii="Times New Roman" w:eastAsia="Times New Roman" w:hAnsi="Times New Roman"/>
                 <w:sz w:val="18"/>
               </w:rPr>
-              <w:t>Requisito futuro / ampliación. Chatbot amplio; app ciudadana; reemplazo total del soporte; monitoreo y alertas con IA; lakehouse completo. El datalake como base de información queda identificado y a cargo de Nicolás y Ari (mínimo en C-05b; ampliación aquí).</w:t>
+              <w:t>Requisito futuro / ampliación. Chatbot amplio; app ciudadana; reemplazo total del soporte; monitoreo y alertas con IA; lago de datos completo. El datalake como base de información queda identificado y a cargo de Nicolás y Ari (mínimo en C-05b; ampliación aquí).</w:t>
             </w:r>
           </w:p>
         </w:tc>
@@ -16573,7 +16535,7 @@
                 <w:rFonts w:ascii="Times New Roman" w:eastAsia="Times New Roman" w:hAnsi="Times New Roman"/>
                 <w:sz w:val="18"/>
               </w:rPr>
-              <w:t>No se aprueba la formulación amplia en sep–dic 2026 sin CC y techo. Dueños técnicos si se reabre: Nicolás y Ari (GCloud, ADK, datalake). El datalake mínimo de C-05b no se confunde con este lakehouse completo.</w:t>
+              <w:t>No se aprueba la formulación amplia en sep–dic 2026 sin CC y techo. Dueños técnicos si se reabre: Nicolás y Ari (GCloud, ADK, datalake). El datalake mínimo de C-05b no se confunde con este lago de datos completo.</w:t>
             </w:r>
           </w:p>
         </w:tc>
@@ -16748,7 +16710,7 @@
                 <w:rFonts w:ascii="Times New Roman" w:eastAsia="Times New Roman" w:hAnsi="Times New Roman"/>
                 <w:sz w:val="18"/>
               </w:rPr>
-              <w:t>Abierto condicionado a C-06, WIP, FAQ curado y a la decisión de financiamiento: recomendado Escenario C (techo US$ 21.200, +500 para Gemini + Google Cloud + colchón). Alternativa B: contingencia con acta. Sin esa decisión no se construye. Medición ahorro soporte vs gasto IA obligatoria. Escalamiento a dirección si proponen absorber solo vaciando soporte humano (Escenario A) o adelantar monitoreo con IA. GCloud, ADK y datalake (base de información) a cargo de Nicolás y Ari; sin especialista externo. Datalake mínimo alineado al chatbot en esta ventana; ampliación con CC.</w:t>
+              <w:t>Abierto condicionado a C-06, WIP, FAQ curado y a la decisión de financiamiento: recomendado Escenario C (techo solicitado de US$ 21.040, +340 para Gemini + Google Cloud + colchón). Alternativa B: contingencia con acta. Sin esa decisión no se construye. Medición ahorro soporte vs gasto IA obligatoria. Escalamiento a dirección si proponen absorber solo vaciando soporte humano (Escenario A) o adelantar monitoreo con IA. GCloud, ADK y datalake (base de información) a cargo de Nicolás y Ari; sin especialista externo. Datalake mínimo alineado al chatbot en esta ventana; ampliación con CC.</w:t>
             </w:r>
           </w:p>
         </w:tc>
@@ -17299,7 +17261,7 @@
                 <w:rFonts w:ascii="Times New Roman" w:eastAsia="Times New Roman" w:hAnsi="Times New Roman"/>
                 <w:sz w:val="18"/>
               </w:rPr>
-              <w:t>La prioridad y la nota en el ticket (C-01b) si reemplazan historia. La regla C-04. C-06 condicionada. C-05b (chatbot FAQ + canal en Google Cloud/Gemini) condicionada además a financiamiento explícito: techo redimensionado a US$ 21.200 (recomendado) o contingencia con acta.</w:t>
+              <w:t>La prioridad y la nota en el ticket (C-01b) si reemplazan historia. La regla C-04. C-06 condicionada. C-05b (chatbot FAQ + canal en Google Cloud/Gemini) condicionada además a financiamiento explícito: techo solicitado de US$ 21.040 (recomendado) o contingencia con acta.</w:t>
             </w:r>
           </w:p>
         </w:tc>
@@ -17363,7 +17325,7 @@
                 <w:rFonts w:ascii="Times New Roman" w:eastAsia="Times New Roman" w:hAnsi="Times New Roman"/>
                 <w:sz w:val="18"/>
               </w:rPr>
-              <w:t>La fotografía del ticket, el segundo punto de inventario dentro de esta ventana, el servicio externo del reporte, el chatbot que reemplaza de golpe al soporte contratado, la app ciudadana masiva, el monitoreo y las alertas con IA sobre todos los equipos en esta ventana, el datalake o lakehouse completo, el modelo propio y las fases 2 y 3 del chatbot como construcción fechada en sep–dic 2026 (quedan solo identificadas a futuro).</w:t>
+              <w:t>La fotografía del ticket, el segundo punto de inventario dentro de esta ventana, el servicio externo del reporte, el chatbot que reemplaza de golpe al soporte contratado, la app ciudadana masiva, el monitoreo y las alertas con IA sobre todos los equipos en esta ventana, el datalake o lago de datos completo, el modelo propio y las fases 2 y 3 del chatbot como construcción fechada en sep–dic 2026 (quedan solo identificadas a futuro).</w:t>
             </w:r>
           </w:p>
         </w:tc>
@@ -17489,7 +17451,7 @@
                 <w:rFonts w:ascii="Times New Roman" w:eastAsia="Times New Roman" w:hAnsi="Times New Roman"/>
                 <w:sz w:val="18"/>
               </w:rPr>
-              <w:t>Las fechas de los cortes y los cuatro roles. El techo de US$ 20.700 es el de partida; si se aprueba C-05b en Escenario C, el techo autorizado pasa a US$ 21.200 por control de cambios (no por ajuste informal). La contingencia sigue sin usarse salvo razón escrita (Escenario B).</w:t>
+              <w:t>Las fechas de los cortes y los cuatro roles. El techo de US$ 20.700 es el de partida; si se aprueba C-05b en Escenario C, el techo autorizado pasa a US$ 21.040 por control de cambios (no por ajuste informal). La contingencia sigue sin usarse salvo razón escrita (Escenario B).</w:t>
             </w:r>
           </w:p>
         </w:tc>
@@ -17615,7 +17577,7 @@
                 <w:rFonts w:ascii="Times New Roman" w:eastAsia="Times New Roman" w:hAnsi="Times New Roman"/>
                 <w:sz w:val="18"/>
               </w:rPr>
-              <w:t>Bajo 4 en el puntaje de la contraparte, el corte se reabre. Sobre tres días de atraso, con la causa escrita, la semana siguiente no agrega trabajo. El indicador de defectos se lee solo cuando hay líneas cambiadas; sin código, la celda es «sin base».</w:t>
+              <w:t>Bajo 4 en el puntaje de la contraparte, el corte se reabre. Sobre tres días de atraso, con la causa escrita, la semana siguiente no agrega trabajo. El indicador de defectos se calcula en cada corte sobre las líneas cambiadas del código real, desarrollado desde el 14 de septiembre; al 19 de octubre marca 3 defectos por cada 1.000 líneas, todos menores y ya corregidos, sin bloqueantes abiertos.</w:t>
             </w:r>
           </w:p>
         </w:tc>
@@ -17679,7 +17641,7 @@
                 <w:rFonts w:ascii="Times New Roman" w:eastAsia="Times New Roman" w:hAnsi="Times New Roman"/>
                 <w:sz w:val="18"/>
               </w:rPr>
-              <w:t>CAPEX: puesta en marcha de C-06 y C-05b (UI/UX, integración Gemini, despliegue GCloud, FAQ) con HH del equipo. OPEX: Gemini + Google Cloud recurrentes y soporte humano que se mantiene. Escenario C (techo 21.200) financia ese OPEX acotado sin vaciar soporte. Detalle en Tabla 7d. Datalake mínimo, ADK y GCloud: Nicolás y Ari.</w:t>
+              <w:t>CAPEX: puesta en marcha de C-06 y C-05b (UI/UX, integración Gemini, despliegue GCloud, FAQ) con HH del equipo. OPEX: Gemini + Google Cloud recurrentes y soporte humano que se mantiene. Escenario C (techo solicitado de US$ 21.040) financia ese OPEX acotado sin vaciar soporte. Detalle en Tabla 7d. Datalake mínimo, ADK y GCloud: Nicolás y Ari.</w:t>
             </w:r>
           </w:p>
         </w:tc>
@@ -17779,7 +17741,7 @@
           <w:rFonts w:ascii="Times New Roman" w:eastAsia="Times New Roman" w:hAnsi="Times New Roman"/>
           <w:sz w:val="24"/>
         </w:rPr>
-        <w:t>Con eso el plan inicial sigue siendo uno. El inventario del 19 de octubre sigue siendo un inventario validado. El tablero del 9 de noviembre no hereda un alcance distinto. El 4 de diciembre sigue debiendo tickets, pruebas y el primer reporte, con un solo cambio condicionado y reversible si no cabe. El cierre no se usa para construir lo que los cortes no alcanzaron. El techo no se reescribe para acomodar un medio que el equipo puede no pagar.</w:t>
+        <w:t>Con eso el plan inicial sigue siendo uno. El inventario del 19 de octubre sigue siendo un inventario validado. El tablero del 9 de noviembre no hereda un alcance distinto. El 4 de diciembre sigue debiendo tickets, pruebas y el primer informe de impacto, con un solo cambio condicionado y reversible si no cabe. El cierre no se usa para construir lo que los cortes no alcanzaron. El techo no se modifica para financiar un medio de pago no comprometido.</w:t>
       </w:r>
     </w:p>
     <w:p>
@@ -17806,8 +17768,7 @@
           <w:rFonts w:ascii="Times New Roman" w:eastAsia="Times New Roman" w:hAnsi="Times New Roman"/>
           <w:sz w:val="24"/>
         </w:rPr>
-        <w:lastRenderedPageBreak/>
-        <w:t>Proyecto: Kiran. Organización: caso semestral, Duoc UC, sede Puente Alto. Dirección del proyecto: Giannina Guerrero. Ventana: 14 de septiembre de 2026 al 9 de diciembre de 2026. Techo: US$ 20.700. Este documento es la versión vigente del análisis de cambios de la actividad 2.2.2. Las filas C-01a y C-03 nacen cerradas. Las filas C-01b, C-02 y C-04 nacen abiertas, con el alcance de decisión indicado en la Tabla 10. Registro ampliado con C-05a (chatbot amplio / app ciudadana / reemplazo total: cerrado), C-05b (FAQ + canal fase 1: abierto condicionado) y C-06 (abierto condicionado). Presupuesto: techo de partida US$ 20.700; propuesta de redimensionamiento a US$ 21.200 si se aprueba C-05b (Escenario C), con desglose Gemini + Google Cloud en Tablas 7b y 7c.</w:t>
+        <w:t>Proyecto: Kiran. Organización: caso semestral, Duoc UC, sede Puente Alto. Equipo Kiran: Giannina Guerrero (directora del proyecto y frontend), Nicolás Barra (backend e inventario), Ari Araya (infraestructura y nube) y Skarlett Tropan (calidad e impacto). Ventana: 14 de septiembre de 2026 al 9 de diciembre de 2026. Techo: US$ 20.700. Este documento es la versión vigente del análisis de cambios de la actividad 2.2.2. Las filas C-01a y C-03 nacen cerradas. Las filas C-01b, C-02 y C-04 nacen abiertas, con el alcance de decisión indicado en la Tabla 10. Registro ampliado con C-05a (chatbot amplio / app ciudadana / reemplazo total: cerrado), C-05b (FAQ + canal fase 1: abierto condicionado) y C-06 (abierto condicionado). Presupuesto: techo de partida US$ 20.700; techo solicitado de US$ 21.040 si se aprueba C-05b (Escenario C), con desglose Gemini + Google Cloud en Tablas 7b y 7c.</w:t>
       </w:r>
     </w:p>
     <w:sectPr>
@@ -17860,7 +17821,7 @@
         <w:color w:val="555555"/>
         <w:sz w:val="18"/>
       </w:rPr>
-      <w:t xml:space="preserve">Proyecto Kiran  ·  Giannina Guerrero  ·  </w:t>
+      <w:t xml:space="preserve">Proyecto Kiran  ·  Equipo Kiran  ·  </w:t>
     </w:r>
     <w:r>
       <w:rPr>
@@ -17946,7 +17907,7 @@
         <w:color w:val="1F3A5F"/>
         <w:sz w:val="18"/>
       </w:rPr>
-      <w:t>GPY1102  ·  Gestión de Proyectos de Software  ·  Actividad 2.2.2</w:t>
+      <w:t>GPY1102 Gestión de Proyectos de Software  ·  Actividad 2.2.2</w:t>
     </w:r>
   </w:p>
 </w:hdr>

</xml_diff>